<commit_message>
Promo Tag Cleanup doc: record Apply scenario paging fix
Co-Authored-By: Claude Opus 5 <noreply@anthropic.com>
</commit_message>
<xml_diff>
--- a/docs/Promo_Tag_Cleanup_Documentation.docx
+++ b/docs/Promo_Tag_Cleanup_Documentation.docx
@@ -280,7 +280,12 @@
     </w:p>
     <w:p>
       <w:r>
-        <w:t xml:space="preserve">Known bug in that scenario: it requests page_size=10000, which Mariana Tek silently ignores. b.cycle returns at most 100 classes per page (SPINCO 200), newest first, and the scenario never reads page 2+. For b.cycle Portes Ouvertes (478 classes, all studios) only the last 100 classes (22-25 Oct) were tagged on 2026-09-17. SPINCO filters by studio so it rarely exceeds 200, but a long window at a busy studio would. Fix: add paging to the scenario.</w:t>
+        <w:t xml:space="preserve">Paging bug (fixed 2026-09-22): the scenario used to request page_size=10000, which Mariana Tek silently ignores. b.cycle returns at most 100 classes per page (SPINCO 200), newest first, and the scenario never read page 2+. For b.cycle Portes Ouvertes (478 classes, all studios) only the last 100 classes (22-25 Oct) were tagged on 2026-09-17.</w:t>
+      </w:r>
+    </w:p>
+    <w:p>
+      <w:r>
+        <w:t xml:space="preserve">Fix: each route now fetches page 1 with page_size=100 only to read meta.pagination.pages ("Count pages"), a Repeater (step 1, required even though it is an advanced field) runs once per page, "Get page of classes" fetches page={{i}}, then the existing iterator and tag call run per class. The aggregator now aggregates over the Repeater, so the "Applied to all classes" checkbox is set once, after every page. Verified: re-applying 5 Cours Portes Ouvertes ran 494 operations (was 106) and covered all 478 classes.</w:t>
       </w:r>
     </w:p>
     <w:p>
@@ -313,7 +318,7 @@
     </w:p>
     <w:p>
       <w:r>
-        <w:t xml:space="preserve">- Classes inside a window that are missing the tag are not reported by the daily job. On 2026-09-22 four SPINCO classes (Westshore 2, Toronto Summerhill 1, Orleans 1) were knowingly left untagged.</w:t>
+        <w:t xml:space="preserve">- Classes inside a window that are missing the tag are not reported by the daily job (the paging fix prevents the main cause). On 2026-09-22 four SPINCO classes (Westshore 2, Toronto Summerhill 1, Orleans 1) were knowingly left untagged.</w:t>
       </w:r>
     </w:p>
     <w:p>

</xml_diff>